<commit_message>
rapport hebdo semaine 4, agenda et évaluation stage
</commit_message>
<xml_diff>
--- a/IntershipReport/Évaluation du stage par létudiant.docx
+++ b/IntershipReport/Évaluation du stage par létudiant.docx
@@ -353,7 +353,7 @@
     </w:p>
     <w:tbl>
       <w:tblPr>
-        <w:tblStyle w:val="Grilledutableau"/>
+        <w:tblStyle w:val="TableGrid"/>
         <w:tblW w:w="10627" w:type="dxa"/>
         <w:tblLook w:val="04A0" w:firstRow="1" w:lastRow="0" w:firstColumn="1" w:lastColumn="0" w:noHBand="0" w:noVBand="1"/>
       </w:tblPr>
@@ -820,11 +820,6 @@
                   <w:listItem w:displayText="Durée trop courte" w:value="Durée trop courte"/>
                 </w:comboBox>
               </w:sdtPr>
-              <w:sdtEndPr>
-                <w:rPr>
-                  <w:rStyle w:val="Style1"/>
-                </w:rPr>
-              </w:sdtEndPr>
               <w:sdtContent>
                 <w:r>
                   <w:rPr>
@@ -873,10 +868,8 @@
                 <w:placeholder>
                   <w:docPart w:val="11FEEA85BAB5455BB0D436D9552913B9"/>
                 </w:placeholder>
-                <w:showingPlcHdr/>
                 <w:text/>
               </w:sdtPr>
-              <w:sdtEndPr/>
               <w:sdtContent>
                 <w:r>
                   <w:rPr>
@@ -884,7 +877,7 @@
                     <w:bCs/>
                     <w:lang w:eastAsia="fr-FR"/>
                   </w:rPr>
-                  <w:t>Cliquez ou appuyez ici pour entrer du texte.</w:t>
+                  <w:t xml:space="preserve"> </w:t>
                 </w:r>
               </w:sdtContent>
             </w:sdt>
@@ -973,7 +966,6 @@
                   <w:listItem w:displayText="Toujours la même tâche à exécuter" w:value="Toujours la même tâche à exécuter"/>
                 </w:comboBox>
               </w:sdtPr>
-              <w:sdtEndPr/>
               <w:sdtContent>
                 <w:r>
                   <w:rPr>
@@ -1024,10 +1016,8 @@
                 <w:placeholder>
                   <w:docPart w:val="943619CF61C44B218E950599300141E1"/>
                 </w:placeholder>
-                <w:showingPlcHdr/>
                 <w:text/>
               </w:sdtPr>
-              <w:sdtEndPr/>
               <w:sdtContent>
                 <w:r>
                   <w:rPr>
@@ -1035,7 +1025,7 @@
                     <w:bCs/>
                     <w:lang w:eastAsia="fr-FR"/>
                   </w:rPr>
-                  <w:t>Cliquez ou appuyez ici pour entrer du texte.</w:t>
+                  <w:t xml:space="preserve"> </w:t>
                 </w:r>
               </w:sdtContent>
             </w:sdt>
@@ -1124,7 +1114,6 @@
                   <w:listItem w:displayText="Beaucoup de période inactives" w:value="Beaucoup de période inactives"/>
                 </w:comboBox>
               </w:sdtPr>
-              <w:sdtEndPr/>
               <w:sdtContent>
                 <w:r>
                   <w:rPr>
@@ -1175,10 +1164,8 @@
                 <w:placeholder>
                   <w:docPart w:val="4AC58A5B4F924A559EB098BA8FA19295"/>
                 </w:placeholder>
-                <w:showingPlcHdr/>
                 <w:text/>
               </w:sdtPr>
-              <w:sdtEndPr/>
               <w:sdtContent>
                 <w:r>
                   <w:rPr>
@@ -1186,7 +1173,7 @@
                     <w:bCs/>
                     <w:lang w:eastAsia="fr-FR"/>
                   </w:rPr>
-                  <w:t>Cliquez ou appuyez ici pour entrer du texte.</w:t>
+                  <w:t xml:space="preserve"> </w:t>
                 </w:r>
               </w:sdtContent>
             </w:sdt>
@@ -1275,7 +1262,6 @@
                   <w:listItem w:displayText="Aucun commentaire du superviseur" w:value="Aucun commentaire du superviseur"/>
                 </w:comboBox>
               </w:sdtPr>
-              <w:sdtEndPr/>
               <w:sdtContent>
                 <w:r>
                   <w:rPr>
@@ -1283,7 +1269,7 @@
                     <w:bCs/>
                     <w:lang w:eastAsia="fr-FR"/>
                   </w:rPr>
-                  <w:t>Beaucoup de commentaires du superviseur</w:t>
+                  <w:t>Quelques commentaires du superviseur</w:t>
                 </w:r>
               </w:sdtContent>
             </w:sdt>
@@ -1326,10 +1312,8 @@
                 <w:placeholder>
                   <w:docPart w:val="3443DFA79D084FB78F0AC43846072EC3"/>
                 </w:placeholder>
-                <w:showingPlcHdr/>
                 <w:text/>
               </w:sdtPr>
-              <w:sdtEndPr/>
               <w:sdtContent>
                 <w:r>
                   <w:rPr>
@@ -1337,7 +1321,7 @@
                     <w:bCs/>
                     <w:lang w:eastAsia="fr-FR"/>
                   </w:rPr>
-                  <w:t>Cliquez ou appuyez ici pour entrer du texte.</w:t>
+                  <w:t xml:space="preserve"> </w:t>
                 </w:r>
               </w:sdtContent>
             </w:sdt>
@@ -1427,7 +1411,6 @@
                   <w:listItem w:displayText="Ne s'applique pas, le genre de travail n'exigeait pas un travail d'équipe" w:value="Ne s'applique pas, le genre de travail n'exigeait pas un travail d'équipe"/>
                 </w:comboBox>
               </w:sdtPr>
-              <w:sdtEndPr/>
               <w:sdtContent>
                 <w:r>
                   <w:rPr>
@@ -1480,7 +1463,6 @@
                 </w:placeholder>
                 <w:text/>
               </w:sdtPr>
-              <w:sdtEndPr/>
               <w:sdtContent>
                 <w:r>
                   <w:rPr>
@@ -1488,7 +1470,7 @@
                     <w:bCs/>
                     <w:lang w:eastAsia="fr-FR"/>
                   </w:rPr>
-                  <w:t>Cliquez ou appuyez ici pour entrer du texte.</w:t>
+                  <w:t xml:space="preserve"> </w:t>
                 </w:r>
               </w:sdtContent>
             </w:sdt>
@@ -1577,7 +1559,6 @@
                   <w:listItem w:displayText="Stage profitable, mais beaucoup d'améliorations seraient nécessaires; spécifiez." w:value="Stage profitable, mais beaucoup d'améliorations seraient nécessaires; spécifiez."/>
                 </w:comboBox>
               </w:sdtPr>
-              <w:sdtEndPr/>
               <w:sdtContent>
                 <w:r>
                   <w:rPr>
@@ -1628,10 +1609,8 @@
                 <w:placeholder>
                   <w:docPart w:val="27E303BCF7E2411EA51DBCD602B2A369"/>
                 </w:placeholder>
-                <w:showingPlcHdr/>
                 <w:text/>
               </w:sdtPr>
-              <w:sdtEndPr/>
               <w:sdtContent>
                 <w:r>
                   <w:rPr>
@@ -1639,7 +1618,7 @@
                     <w:bCs/>
                     <w:lang w:eastAsia="fr-FR"/>
                   </w:rPr>
-                  <w:t>Cliquez ou appuyez ici pour entrer du texte.</w:t>
+                  <w:t xml:space="preserve"> </w:t>
                 </w:r>
               </w:sdtContent>
             </w:sdt>
@@ -1846,7 +1825,7 @@
   </w:p>
   <w:p>
     <w:pPr>
-      <w:pStyle w:val="En-tte"/>
+      <w:pStyle w:val="Header"/>
     </w:pPr>
     <w:r>
       <w:rPr>
@@ -1914,7 +1893,7 @@
   </w:p>
   <w:p>
     <w:pPr>
-      <w:pStyle w:val="En-tte"/>
+      <w:pStyle w:val="Header"/>
     </w:pPr>
   </w:p>
 </w:hdr>
@@ -2532,13 +2511,13 @@
     <w:name w:val="Normal"/>
     <w:qFormat/>
   </w:style>
-  <w:style w:type="character" w:default="1" w:styleId="Policepardfaut">
+  <w:style w:type="character" w:default="1" w:styleId="DefaultParagraphFont">
     <w:name w:val="Default Paragraph Font"/>
     <w:uiPriority w:val="1"/>
     <w:semiHidden/>
     <w:unhideWhenUsed/>
   </w:style>
-  <w:style w:type="table" w:default="1" w:styleId="TableauNormal">
+  <w:style w:type="table" w:default="1" w:styleId="TableNormal">
     <w:name w:val="Normal Table"/>
     <w:uiPriority w:val="99"/>
     <w:semiHidden/>
@@ -2553,16 +2532,16 @@
       </w:tblCellMar>
     </w:tblPr>
   </w:style>
-  <w:style w:type="numbering" w:default="1" w:styleId="Aucuneliste">
+  <w:style w:type="numbering" w:default="1" w:styleId="NoList">
     <w:name w:val="No List"/>
     <w:uiPriority w:val="99"/>
     <w:semiHidden/>
     <w:unhideWhenUsed/>
   </w:style>
-  <w:style w:type="paragraph" w:styleId="En-tte">
+  <w:style w:type="paragraph" w:styleId="Header">
     <w:name w:val="header"/>
     <w:basedOn w:val="Normal"/>
-    <w:link w:val="En-tteCar"/>
+    <w:link w:val="HeaderChar"/>
     <w:uiPriority w:val="99"/>
     <w:unhideWhenUsed/>
     <w:rsid w:val="00606D0D"/>
@@ -2574,17 +2553,17 @@
       <w:spacing w:after="0" w:line="240" w:lineRule="auto"/>
     </w:pPr>
   </w:style>
-  <w:style w:type="character" w:customStyle="1" w:styleId="En-tteCar">
-    <w:name w:val="En-tête Car"/>
-    <w:basedOn w:val="Policepardfaut"/>
-    <w:link w:val="En-tte"/>
+  <w:style w:type="character" w:customStyle="1" w:styleId="HeaderChar">
+    <w:name w:val="Header Char"/>
+    <w:basedOn w:val="DefaultParagraphFont"/>
+    <w:link w:val="Header"/>
     <w:uiPriority w:val="99"/>
     <w:rsid w:val="00606D0D"/>
   </w:style>
-  <w:style w:type="paragraph" w:styleId="Pieddepage">
+  <w:style w:type="paragraph" w:styleId="Footer">
     <w:name w:val="footer"/>
     <w:basedOn w:val="Normal"/>
-    <w:link w:val="PieddepageCar"/>
+    <w:link w:val="FooterChar"/>
     <w:uiPriority w:val="99"/>
     <w:unhideWhenUsed/>
     <w:rsid w:val="005C0A9A"/>
@@ -2596,16 +2575,16 @@
       <w:spacing w:after="0" w:line="240" w:lineRule="auto"/>
     </w:pPr>
   </w:style>
-  <w:style w:type="character" w:customStyle="1" w:styleId="PieddepageCar">
-    <w:name w:val="Pied de page Car"/>
-    <w:basedOn w:val="Policepardfaut"/>
-    <w:link w:val="Pieddepage"/>
+  <w:style w:type="character" w:customStyle="1" w:styleId="FooterChar">
+    <w:name w:val="Footer Char"/>
+    <w:basedOn w:val="DefaultParagraphFont"/>
+    <w:link w:val="Footer"/>
     <w:uiPriority w:val="99"/>
     <w:rsid w:val="005C0A9A"/>
   </w:style>
-  <w:style w:type="table" w:styleId="Grilledutableau">
+  <w:style w:type="table" w:styleId="TableGrid">
     <w:name w:val="Table Grid"/>
-    <w:basedOn w:val="TableauNormal"/>
+    <w:basedOn w:val="TableNormal"/>
     <w:uiPriority w:val="39"/>
     <w:rsid w:val="00F56529"/>
     <w:pPr>
@@ -2622,7 +2601,7 @@
       </w:tblBorders>
     </w:tblPr>
   </w:style>
-  <w:style w:type="paragraph" w:styleId="Paragraphedeliste">
+  <w:style w:type="paragraph" w:styleId="ListParagraph">
     <w:name w:val="List Paragraph"/>
     <w:basedOn w:val="Normal"/>
     <w:uiPriority w:val="34"/>
@@ -2633,9 +2612,9 @@
       <w:contextualSpacing/>
     </w:pPr>
   </w:style>
-  <w:style w:type="character" w:styleId="Textedelespacerserv">
+  <w:style w:type="character" w:styleId="PlaceholderText">
     <w:name w:val="Placeholder Text"/>
-    <w:basedOn w:val="Policepardfaut"/>
+    <w:basedOn w:val="DefaultParagraphFont"/>
     <w:uiPriority w:val="99"/>
     <w:semiHidden/>
     <w:rsid w:val="00B551CE"/>
@@ -2645,7 +2624,7 @@
   </w:style>
   <w:style w:type="character" w:customStyle="1" w:styleId="Style1">
     <w:name w:val="Style1"/>
-    <w:basedOn w:val="Policepardfaut"/>
+    <w:basedOn w:val="DefaultParagraphFont"/>
     <w:uiPriority w:val="1"/>
     <w:rsid w:val="00C4674F"/>
     <w:rPr>
@@ -2655,7 +2634,7 @@
   </w:style>
   <w:style w:type="character" w:customStyle="1" w:styleId="Style2">
     <w:name w:val="Style2"/>
-    <w:basedOn w:val="Policepardfaut"/>
+    <w:basedOn w:val="DefaultParagraphFont"/>
     <w:uiPriority w:val="1"/>
     <w:rsid w:val="00C4674F"/>
     <w:rPr>
@@ -2691,7 +2670,7 @@
           </w:pPr>
           <w:r>
             <w:rPr>
-              <w:rStyle w:val="Textedelespacerserv"/>
+              <w:rStyle w:val="PlaceholderText"/>
             </w:rPr>
             <w:t>Choisissez un élément.</w:t>
           </w:r>
@@ -2720,7 +2699,7 @@
           </w:pPr>
           <w:r>
             <w:rPr>
-              <w:rStyle w:val="Textedelespacerserv"/>
+              <w:rStyle w:val="PlaceholderText"/>
             </w:rPr>
             <w:t>Cliquez ou appuyez ici pour entrer du texte.</w:t>
           </w:r>
@@ -2749,7 +2728,7 @@
           </w:pPr>
           <w:r>
             <w:rPr>
-              <w:rStyle w:val="Textedelespacerserv"/>
+              <w:rStyle w:val="PlaceholderText"/>
             </w:rPr>
             <w:t>Cliquez ou appuyez ici pour entrer du texte.</w:t>
           </w:r>
@@ -2778,7 +2757,7 @@
           </w:pPr>
           <w:r>
             <w:rPr>
-              <w:rStyle w:val="Textedelespacerserv"/>
+              <w:rStyle w:val="PlaceholderText"/>
             </w:rPr>
             <w:t>Cliquez ou appuyez ici pour entrer du texte.</w:t>
           </w:r>
@@ -2807,7 +2786,7 @@
           </w:pPr>
           <w:r>
             <w:rPr>
-              <w:rStyle w:val="Textedelespacerserv"/>
+              <w:rStyle w:val="PlaceholderText"/>
             </w:rPr>
             <w:t>Cliquez ou appuyez ici pour entrer du texte.</w:t>
           </w:r>
@@ -2836,7 +2815,7 @@
           </w:pPr>
           <w:r>
             <w:rPr>
-              <w:rStyle w:val="Textedelespacerserv"/>
+              <w:rStyle w:val="PlaceholderText"/>
             </w:rPr>
             <w:t>Cliquez ou appuyez ici pour entrer du texte.</w:t>
           </w:r>
@@ -2865,7 +2844,7 @@
           </w:pPr>
           <w:r>
             <w:rPr>
-              <w:rStyle w:val="Textedelespacerserv"/>
+              <w:rStyle w:val="PlaceholderText"/>
             </w:rPr>
             <w:t>Cliquez ou appuyez ici pour entrer du texte.</w:t>
           </w:r>
@@ -2894,7 +2873,7 @@
           </w:pPr>
           <w:r>
             <w:rPr>
-              <w:rStyle w:val="Textedelespacerserv"/>
+              <w:rStyle w:val="PlaceholderText"/>
             </w:rPr>
             <w:t>Choisissez un élément.</w:t>
           </w:r>
@@ -2923,7 +2902,7 @@
           </w:pPr>
           <w:r>
             <w:rPr>
-              <w:rStyle w:val="Textedelespacerserv"/>
+              <w:rStyle w:val="PlaceholderText"/>
             </w:rPr>
             <w:t>Choisissez un élément.</w:t>
           </w:r>
@@ -2952,7 +2931,7 @@
           </w:pPr>
           <w:r>
             <w:rPr>
-              <w:rStyle w:val="Textedelespacerserv"/>
+              <w:rStyle w:val="PlaceholderText"/>
             </w:rPr>
             <w:t>Choisissez un élément.</w:t>
           </w:r>
@@ -2981,7 +2960,7 @@
           </w:pPr>
           <w:r>
             <w:rPr>
-              <w:rStyle w:val="Textedelespacerserv"/>
+              <w:rStyle w:val="PlaceholderText"/>
             </w:rPr>
             <w:t>Choisissez un élément.</w:t>
           </w:r>
@@ -3010,7 +2989,7 @@
           </w:pPr>
           <w:r>
             <w:rPr>
-              <w:rStyle w:val="Textedelespacerserv"/>
+              <w:rStyle w:val="PlaceholderText"/>
             </w:rPr>
             <w:t>Choisissez un élément.</w:t>
           </w:r>
@@ -3039,7 +3018,7 @@
           </w:pPr>
           <w:r>
             <w:rPr>
-              <w:rStyle w:val="Textedelespacerserv"/>
+              <w:rStyle w:val="PlaceholderText"/>
             </w:rPr>
             <w:t>Cliquez ou appuyez ici pour entrer du texte.</w:t>
           </w:r>
@@ -3068,7 +3047,7 @@
           </w:pPr>
           <w:r>
             <w:rPr>
-              <w:rStyle w:val="Textedelespacerserv"/>
+              <w:rStyle w:val="PlaceholderText"/>
             </w:rPr>
             <w:t>Cliquez ou appuyez ici pour entrer du texte.</w:t>
           </w:r>
@@ -3100,12 +3079,12 @@
     <w:charset w:val="00"/>
     <w:family w:val="swiss"/>
     <w:pitch w:val="variable"/>
-    <w:sig w:usb0="E0002EFF" w:usb1="C000785B" w:usb2="00000009" w:usb3="00000000" w:csb0="000001FF" w:csb1="00000000"/>
+    <w:sig w:usb0="E0002AFF" w:usb1="C0007843" w:usb2="00000009" w:usb3="00000000" w:csb0="000001FF" w:csb1="00000000"/>
   </w:font>
   <w:font w:name="Symbol">
     <w:panose1 w:val="05050102010706020507"/>
     <w:charset w:val="02"/>
-    <w:family w:val="roman"/>
+    <w:family w:val="decorative"/>
     <w:pitch w:val="variable"/>
     <w:sig w:usb0="00000000" w:usb1="10000000" w:usb2="00000000" w:usb3="00000000" w:csb0="80000000" w:csb1="00000000"/>
   </w:font>
@@ -3121,7 +3100,7 @@
     <w:charset w:val="00"/>
     <w:family w:val="swiss"/>
     <w:pitch w:val="variable"/>
-    <w:sig w:usb0="E4002EFF" w:usb1="C200247B" w:usb2="00000009" w:usb3="00000000" w:csb0="000001FF" w:csb1="00000000"/>
+    <w:sig w:usb0="E0002AFF" w:usb1="C000247B" w:usb2="00000009" w:usb3="00000000" w:csb0="000001FF" w:csb1="00000000"/>
   </w:font>
   <w:font w:name="Calibri Light">
     <w:panose1 w:val="020F0302020204030204"/>
@@ -3131,12 +3110,14 @@
     <w:sig w:usb0="E4002EFF" w:usb1="C200247B" w:usb2="00000009" w:usb3="00000000" w:csb0="000001FF" w:csb1="00000000"/>
   </w:font>
   <w:font w:name="Aptos">
+    <w:panose1 w:val="020B0004020202020204"/>
     <w:charset w:val="00"/>
     <w:family w:val="swiss"/>
     <w:pitch w:val="variable"/>
     <w:sig w:usb0="20000287" w:usb1="00000003" w:usb2="00000000" w:usb3="00000000" w:csb0="0000019F" w:csb1="00000000"/>
   </w:font>
   <w:font w:name="Aptos Display">
+    <w:panose1 w:val="020B0004020202020204"/>
     <w:charset w:val="00"/>
     <w:family w:val="swiss"/>
     <w:pitch w:val="variable"/>
@@ -3164,11 +3145,14 @@
     <w:rsidRoot w:val="00587856"/>
     <w:rsid w:val="000B57AF"/>
     <w:rsid w:val="0018126E"/>
+    <w:rsid w:val="00555843"/>
     <w:rsid w:val="005865EF"/>
     <w:rsid w:val="00587856"/>
     <w:rsid w:val="006D1F6A"/>
+    <w:rsid w:val="0071669C"/>
     <w:rsid w:val="008134DB"/>
     <w:rsid w:val="008915D6"/>
+    <w:rsid w:val="008A1AE6"/>
     <w:rsid w:val="00910CF8"/>
     <w:rsid w:val="00B17075"/>
     <w:rsid w:val="00D26456"/>
@@ -3190,8 +3174,8 @@
   </m:mathPr>
   <w:themeFontLang w:val="fr-CA"/>
   <w:clrSchemeMapping w:bg1="light1" w:t1="dark1" w:bg2="light2" w:t2="dark2" w:accent1="accent1" w:accent2="accent2" w:accent3="accent3" w:accent4="accent4" w:accent5="accent5" w:accent6="accent6" w:hyperlink="hyperlink" w:followedHyperlink="followedHyperlink"/>
-  <w:decimalSymbol w:val=","/>
-  <w:listSeparator w:val=";"/>
+  <w:decimalSymbol w:val="."/>
+  <w:listSeparator w:val=","/>
   <w15:chartTrackingRefBased/>
 </w:settings>
 </file>
@@ -3595,13 +3579,13 @@
     <w:name w:val="Normal"/>
     <w:qFormat/>
   </w:style>
-  <w:style w:type="character" w:default="1" w:styleId="Policepardfaut">
+  <w:style w:type="character" w:default="1" w:styleId="DefaultParagraphFont">
     <w:name w:val="Default Paragraph Font"/>
     <w:uiPriority w:val="1"/>
     <w:semiHidden/>
     <w:unhideWhenUsed/>
   </w:style>
-  <w:style w:type="table" w:default="1" w:styleId="TableauNormal">
+  <w:style w:type="table" w:default="1" w:styleId="TableNormal">
     <w:name w:val="Normal Table"/>
     <w:uiPriority w:val="99"/>
     <w:semiHidden/>
@@ -3616,15 +3600,15 @@
       </w:tblCellMar>
     </w:tblPr>
   </w:style>
-  <w:style w:type="numbering" w:default="1" w:styleId="Aucuneliste">
+  <w:style w:type="numbering" w:default="1" w:styleId="NoList">
     <w:name w:val="No List"/>
     <w:uiPriority w:val="99"/>
     <w:semiHidden/>
     <w:unhideWhenUsed/>
   </w:style>
-  <w:style w:type="character" w:styleId="Textedelespacerserv">
+  <w:style w:type="character" w:styleId="PlaceholderText">
     <w:name w:val="Placeholder Text"/>
-    <w:basedOn w:val="Policepardfaut"/>
+    <w:basedOn w:val="DefaultParagraphFont"/>
     <w:uiPriority w:val="99"/>
     <w:semiHidden/>
     <w:rsid w:val="006D1F6A"/>

</xml_diff>